<commit_message>
Toán 11 Bài 10 – 17: chèn video mở đầu vào HĐ1, cân đối lại thời gian; cập nhật KHBD
Co-Authored-By: Claude Opus 5.5 <noreply@anthropic.com>
</commit_message>
<xml_diff>
--- a/mon/toan/khbd/lop11/KHBD_TOAN11_Bai10_DuongThangMatPhang_T26-28.docx
+++ b/mon/toan/khbd/lop11/KHBD_TOAN11_Bai10_DuongThangMatPhang_T26-28.docx
@@ -1431,7 +1431,7 @@
                 <w:rFonts w:ascii="Times New Roman" w:hAnsi="Times New Roman" w:eastAsia="Times New Roman" w:cs="Times New Roman"/>
                 <w:sz w:val="24"/>
               </w:rPr>
-              <w:t>5</w:t>
+              <w:t>7</w:t>
             </w:r>
           </w:p>
         </w:tc>
@@ -1535,7 +1535,7 @@
                 <w:rFonts w:ascii="Times New Roman" w:hAnsi="Times New Roman" w:eastAsia="Times New Roman" w:cs="Times New Roman"/>
                 <w:sz w:val="24"/>
               </w:rPr>
-              <w:t>28</w:t>
+              <w:t>26</w:t>
             </w:r>
           </w:p>
         </w:tc>
@@ -2005,7 +2005,7 @@
           <w:b/>
           <w:sz w:val="24"/>
         </w:rPr>
-        <w:t>1. Hoạt động 1: Mở đầu (5 phút)</w:t>
+        <w:t>1. Hoạt động 1: Mở đầu (7 phút)</w:t>
       </w:r>
     </w:p>
     <w:p>
@@ -2055,6 +2055,67 @@
           <w:b/>
           <w:sz w:val="24"/>
         </w:rPr>
+        <w:t>Video mở đầu</w:t>
+      </w:r>
+      <w:r>
+        <w:rPr>
+          <w:rFonts w:ascii="Times New Roman" w:hAnsi="Times New Roman" w:eastAsia="Times New Roman" w:cs="Times New Roman"/>
+          <w:sz w:val="24"/>
+        </w:rPr>
+        <w:t xml:space="preserve"> (0 phút 52 giây; ảnh thật, lồng tiếng và phụ đề tiếng Việt): https://trangtu66.github.io/Taode_thi_online/mon/toan/video/lop11/VIDEO_MoDau_TOAN11_Bai10_DuongThangMatPhang.mp4. GV chiếu đầu tiết (bản Full HD trên máy: KHBD_TOAN10\video_mo_dau\t11_bai10); HS quét mã QR để xem lại. Video chỉ nêu tình huống, câu hỏi – không nói đáp án.</w:t>
+      </w:r>
+    </w:p>
+    <w:p>
+      <w:pPr>
+        <w:spacing w:before="40" w:after="80" w:line="264" w:lineRule="auto"/>
+        <w:jc w:val="center"/>
+      </w:pPr>
+      <w:r>
+        <w:drawing>
+          <wp:inline xmlns:a="http://schemas.openxmlformats.org/drawingml/2006/main" xmlns:pic="http://schemas.openxmlformats.org/drawingml/2006/picture">
+            <wp:extent cx="936000" cy="936000"/>
+            <wp:docPr id="2" name="Picture 2"/>
+            <wp:cNvGraphicFramePr>
+              <a:graphicFrameLocks noChangeAspect="1"/>
+            </wp:cNvGraphicFramePr>
+            <a:graphic>
+              <a:graphicData uri="http://schemas.openxmlformats.org/drawingml/2006/picture">
+                <pic:pic>
+                  <pic:nvPicPr>
+                    <pic:cNvPr id="0" name="QR_VideoMoDau_t11_bai10.png"/>
+                    <pic:cNvPicPr/>
+                  </pic:nvPicPr>
+                  <pic:blipFill>
+                    <a:blip r:embed="rId12"/>
+                    <a:stretch>
+                      <a:fillRect/>
+                    </a:stretch>
+                  </pic:blipFill>
+                  <pic:spPr>
+                    <a:xfrm>
+                      <a:off x="0" y="0"/>
+                      <a:ext cx="936000" cy="936000"/>
+                    </a:xfrm>
+                    <a:prstGeom prst="rect"/>
+                  </pic:spPr>
+                </pic:pic>
+              </a:graphicData>
+            </a:graphic>
+          </wp:inline>
+        </w:drawing>
+      </w:r>
+    </w:p>
+    <w:p>
+      <w:pPr>
+        <w:spacing w:before="0" w:after="60" w:line="264" w:lineRule="auto"/>
+        <w:jc w:val="both"/>
+      </w:pPr>
+      <w:r>
+        <w:rPr>
+          <w:rFonts w:ascii="Times New Roman" w:hAnsi="Times New Roman" w:eastAsia="Times New Roman" w:cs="Times New Roman"/>
+          <w:b/>
+          <w:sz w:val="24"/>
+        </w:rPr>
         <w:t>Giới thiệu chương (SGK tr.70).</w:t>
       </w:r>
       <w:r>
@@ -2141,7 +2202,7 @@
           <w:rFonts w:ascii="Times New Roman" w:hAnsi="Times New Roman" w:eastAsia="Times New Roman" w:cs="Times New Roman"/>
           <w:sz w:val="24"/>
         </w:rPr>
-        <w:t xml:space="preserve"> GV chiếu hình ảnh CAD, in 3D; đưa hộp phấn, rubik.</w:t>
+        <w:t xml:space="preserve"> GV chiếu video mở đầu (0 phút 52 giây). Sau video, GV chiếu hình ảnh CAD, in 3D; đưa hộp phấn, rubik.</w:t>
       </w:r>
     </w:p>
     <w:p>
@@ -2246,7 +2307,7 @@
           <w:b/>
           <w:sz w:val="24"/>
         </w:rPr>
-        <w:t>2. Hoạt động 2: Hình thành kiến thức mới (85 phút)</w:t>
+        <w:t>2. Hoạt động 2: Hình thành kiến thức mới (83 phút)</w:t>
       </w:r>
     </w:p>
     <w:p>
@@ -2431,7 +2492,7 @@
         <w:drawing>
           <wp:inline xmlns:a="http://schemas.openxmlformats.org/drawingml/2006/main" xmlns:pic="http://schemas.openxmlformats.org/drawingml/2006/picture">
             <wp:extent cx="1440000" cy="1031642"/>
-            <wp:docPr id="2" name="Picture 2"/>
+            <wp:docPr id="3" name="Picture 3"/>
             <wp:cNvGraphicFramePr>
               <a:graphicFrameLocks noChangeAspect="1"/>
             </wp:cNvGraphicFramePr>
@@ -2443,7 +2504,7 @@
                     <pic:cNvPicPr/>
                   </pic:nvPicPr>
                   <pic:blipFill>
-                    <a:blip r:embed="rId12"/>
+                    <a:blip r:embed="rId13"/>
                     <a:stretch>
                       <a:fillRect/>
                     </a:stretch>
@@ -2902,7 +2963,7 @@
           <w:b/>
           <w:sz w:val="24"/>
         </w:rPr>
-        <w:t>2.2. Các tính chất thừa nhận (28 phút + 10 phút ở Tiết 2)</w:t>
+        <w:t>2.2. Các tính chất thừa nhận (26 phút + 10 phút ở Tiết 2)</w:t>
       </w:r>
     </w:p>
     <w:p>
@@ -3314,7 +3375,7 @@
         <w:drawing>
           <wp:inline xmlns:a="http://schemas.openxmlformats.org/drawingml/2006/main" xmlns:pic="http://schemas.openxmlformats.org/drawingml/2006/picture">
             <wp:extent cx="1224000" cy="1185509"/>
-            <wp:docPr id="3" name="Picture 3"/>
+            <wp:docPr id="4" name="Picture 4"/>
             <wp:cNvGraphicFramePr>
               <a:graphicFrameLocks noChangeAspect="1"/>
             </wp:cNvGraphicFramePr>
@@ -3326,7 +3387,7 @@
                     <pic:cNvPicPr/>
                   </pic:nvPicPr>
                   <pic:blipFill>
-                    <a:blip r:embed="rId13"/>
+                    <a:blip r:embed="rId14"/>
                     <a:stretch>
                       <a:fillRect/>
                     </a:stretch>
@@ -3853,7 +3914,7 @@
         <w:drawing>
           <wp:inline xmlns:a="http://schemas.openxmlformats.org/drawingml/2006/main" xmlns:pic="http://schemas.openxmlformats.org/drawingml/2006/picture">
             <wp:extent cx="1440000" cy="1037906"/>
-            <wp:docPr id="4" name="Picture 4"/>
+            <wp:docPr id="5" name="Picture 5"/>
             <wp:cNvGraphicFramePr>
               <a:graphicFrameLocks noChangeAspect="1"/>
             </wp:cNvGraphicFramePr>
@@ -3865,7 +3926,7 @@
                     <pic:cNvPicPr/>
                   </pic:nvPicPr>
                   <pic:blipFill>
-                    <a:blip r:embed="rId14"/>
+                    <a:blip r:embed="rId15"/>
                     <a:stretch>
                       <a:fillRect/>
                     </a:stretch>
@@ -4298,7 +4359,7 @@
         <w:drawing>
           <wp:inline xmlns:a="http://schemas.openxmlformats.org/drawingml/2006/main" xmlns:pic="http://schemas.openxmlformats.org/drawingml/2006/picture">
             <wp:extent cx="1440000" cy="995436"/>
-            <wp:docPr id="5" name="Picture 5"/>
+            <wp:docPr id="6" name="Picture 6"/>
             <wp:cNvGraphicFramePr>
               <a:graphicFrameLocks noChangeAspect="1"/>
             </wp:cNvGraphicFramePr>
@@ -4310,7 +4371,7 @@
                     <pic:cNvPicPr/>
                   </pic:nvPicPr>
                   <pic:blipFill>
-                    <a:blip r:embed="rId15"/>
+                    <a:blip r:embed="rId16"/>
                     <a:stretch>
                       <a:fillRect/>
                     </a:stretch>
@@ -4712,7 +4773,7 @@
         <w:drawing>
           <wp:inline xmlns:a="http://schemas.openxmlformats.org/drawingml/2006/main" xmlns:pic="http://schemas.openxmlformats.org/drawingml/2006/picture">
             <wp:extent cx="1512000" cy="1381004"/>
-            <wp:docPr id="6" name="Picture 6"/>
+            <wp:docPr id="7" name="Picture 7"/>
             <wp:cNvGraphicFramePr>
               <a:graphicFrameLocks noChangeAspect="1"/>
             </wp:cNvGraphicFramePr>
@@ -4724,7 +4785,7 @@
                     <pic:cNvPicPr/>
                   </pic:nvPicPr>
                   <pic:blipFill>
-                    <a:blip r:embed="rId16"/>
+                    <a:blip r:embed="rId17"/>
                     <a:stretch>
                       <a:fillRect/>
                     </a:stretch>
@@ -6110,7 +6171,7 @@
         <w:drawing>
           <wp:inline xmlns:a="http://schemas.openxmlformats.org/drawingml/2006/main" xmlns:pic="http://schemas.openxmlformats.org/drawingml/2006/picture">
             <wp:extent cx="1512000" cy="598101"/>
-            <wp:docPr id="7" name="Picture 7"/>
+            <wp:docPr id="8" name="Picture 8"/>
             <wp:cNvGraphicFramePr>
               <a:graphicFrameLocks noChangeAspect="1"/>
             </wp:cNvGraphicFramePr>
@@ -6122,7 +6183,7 @@
                     <pic:cNvPicPr/>
                   </pic:nvPicPr>
                   <pic:blipFill>
-                    <a:blip r:embed="rId17"/>
+                    <a:blip r:embed="rId18"/>
                     <a:stretch>
                       <a:fillRect/>
                     </a:stretch>
@@ -6460,7 +6521,7 @@
         <w:drawing>
           <wp:inline xmlns:a="http://schemas.openxmlformats.org/drawingml/2006/main" xmlns:pic="http://schemas.openxmlformats.org/drawingml/2006/picture">
             <wp:extent cx="1512000" cy="988063"/>
-            <wp:docPr id="8" name="Picture 8"/>
+            <wp:docPr id="9" name="Picture 9"/>
             <wp:cNvGraphicFramePr>
               <a:graphicFrameLocks noChangeAspect="1"/>
             </wp:cNvGraphicFramePr>
@@ -6472,7 +6533,7 @@
                     <pic:cNvPicPr/>
                   </pic:nvPicPr>
                   <pic:blipFill>
-                    <a:blip r:embed="rId18"/>
+                    <a:blip r:embed="rId19"/>
                     <a:stretch>
                       <a:fillRect/>
                     </a:stretch>
@@ -8055,7 +8116,7 @@
         <w:drawing>
           <wp:inline xmlns:a="http://schemas.openxmlformats.org/drawingml/2006/main" xmlns:pic="http://schemas.openxmlformats.org/drawingml/2006/picture">
             <wp:extent cx="1296000" cy="1120865"/>
-            <wp:docPr id="9" name="Picture 9"/>
+            <wp:docPr id="10" name="Picture 10"/>
             <wp:cNvGraphicFramePr>
               <a:graphicFrameLocks noChangeAspect="1"/>
             </wp:cNvGraphicFramePr>
@@ -8067,7 +8128,7 @@
                     <pic:cNvPicPr/>
                   </pic:nvPicPr>
                   <pic:blipFill>
-                    <a:blip r:embed="rId19"/>
+                    <a:blip r:embed="rId20"/>
                     <a:stretch>
                       <a:fillRect/>
                     </a:stretch>
@@ -8792,7 +8853,7 @@
         <w:drawing>
           <wp:inline xmlns:a="http://schemas.openxmlformats.org/drawingml/2006/main" xmlns:pic="http://schemas.openxmlformats.org/drawingml/2006/picture">
             <wp:extent cx="1296000" cy="1389450"/>
-            <wp:docPr id="10" name="Picture 10"/>
+            <wp:docPr id="11" name="Picture 11"/>
             <wp:cNvGraphicFramePr>
               <a:graphicFrameLocks noChangeAspect="1"/>
             </wp:cNvGraphicFramePr>
@@ -8804,7 +8865,7 @@
                     <pic:cNvPicPr/>
                   </pic:nvPicPr>
                   <pic:blipFill>
-                    <a:blip r:embed="rId20"/>
+                    <a:blip r:embed="rId21"/>
                     <a:stretch>
                       <a:fillRect/>
                     </a:stretch>
@@ -10831,7 +10892,7 @@
         <w:drawing>
           <wp:inline xmlns:a="http://schemas.openxmlformats.org/drawingml/2006/main" xmlns:pic="http://schemas.openxmlformats.org/drawingml/2006/picture">
             <wp:extent cx="6300000" cy="3537572"/>
-            <wp:docPr id="11" name="Picture 11"/>
+            <wp:docPr id="12" name="Picture 12"/>
             <wp:cNvGraphicFramePr>
               <a:graphicFrameLocks noChangeAspect="1"/>
             </wp:cNvGraphicFramePr>
@@ -10843,7 +10904,7 @@
                     <pic:cNvPicPr/>
                   </pic:nvPicPr>
                   <pic:blipFill>
-                    <a:blip r:embed="rId21"/>
+                    <a:blip r:embed="rId22"/>
                     <a:stretch>
                       <a:fillRect/>
                     </a:stretch>
@@ -10904,7 +10965,7 @@
               <w:drawing>
                 <wp:inline xmlns:a="http://schemas.openxmlformats.org/drawingml/2006/main" xmlns:pic="http://schemas.openxmlformats.org/drawingml/2006/picture">
                   <wp:extent cx="1296000" cy="1296000"/>
-                  <wp:docPr id="12" name="Picture 12"/>
+                  <wp:docPr id="13" name="Picture 13"/>
                   <wp:cNvGraphicFramePr>
                     <a:graphicFrameLocks noChangeAspect="1"/>
                   </wp:cNvGraphicFramePr>
@@ -10916,7 +10977,7 @@
                           <pic:cNvPicPr/>
                         </pic:nvPicPr>
                         <pic:blipFill>
-                          <a:blip r:embed="rId22"/>
+                          <a:blip r:embed="rId23"/>
                           <a:stretch>
                             <a:fillRect/>
                           </a:stretch>
@@ -17597,6 +17658,84 @@
                 <w:sz w:val="24"/>
               </w:rPr>
               <w:t>Dùng ở</w:t>
+            </w:r>
+          </w:p>
+        </w:tc>
+      </w:tr>
+      <w:tr>
+        <w:tc>
+          <w:tcPr>
+            <w:tcW w:type="dxa" w:w="3061"/>
+            <w:vAlign w:val="center"/>
+          </w:tcPr>
+          <w:p>
+            <w:pPr>
+              <w:spacing w:before="0" w:after="20" w:line="264" w:lineRule="auto"/>
+              <w:jc w:val="left"/>
+            </w:pPr>
+            <w:r>
+              <w:rPr>
+                <w:rFonts w:ascii="Times New Roman" w:hAnsi="Times New Roman" w:eastAsia="Times New Roman" w:cs="Times New Roman"/>
+                <w:sz w:val="24"/>
+              </w:rPr>
+              <w:t>Video mở đầu – Bài 10. Đường thẳng và mặt phẳng trong không gian (GV tự dựng)</w:t>
+            </w:r>
+          </w:p>
+        </w:tc>
+        <w:tc>
+          <w:tcPr>
+            <w:tcW w:type="dxa" w:w="2041"/>
+            <w:vAlign w:val="center"/>
+          </w:tcPr>
+          <w:p>
+            <w:pPr>
+              <w:spacing w:before="0" w:after="20" w:line="264" w:lineRule="auto"/>
+              <w:jc w:val="center"/>
+            </w:pPr>
+            <w:r>
+              <w:rPr>
+                <w:rFonts w:ascii="Times New Roman" w:hAnsi="Times New Roman" w:eastAsia="Times New Roman" w:cs="Times New Roman"/>
+                <w:sz w:val="24"/>
+              </w:rPr>
+              <w:t>Taode_thi_online (ảnh Wikimedia Commons, giọng đọc tổng hợp)</w:t>
+            </w:r>
+          </w:p>
+        </w:tc>
+        <w:tc>
+          <w:tcPr>
+            <w:tcW w:type="dxa" w:w="3061"/>
+            <w:vAlign w:val="center"/>
+          </w:tcPr>
+          <w:p>
+            <w:pPr>
+              <w:spacing w:before="0" w:after="20" w:line="264" w:lineRule="auto"/>
+              <w:jc w:val="center"/>
+            </w:pPr>
+            <w:r>
+              <w:rPr>
+                <w:rFonts w:ascii="Times New Roman" w:hAnsi="Times New Roman" w:eastAsia="Times New Roman" w:cs="Times New Roman"/>
+                <w:sz w:val="24"/>
+              </w:rPr>
+              <w:t>https://trangtu66.github.io/Taode_thi_online/mon/toan/video/lop11/VIDEO_MoDau_TOAN11_Bai10_DuongThangMatPhang.mp4</w:t>
+            </w:r>
+          </w:p>
+        </w:tc>
+        <w:tc>
+          <w:tcPr>
+            <w:tcW w:type="dxa" w:w="2041"/>
+            <w:vAlign w:val="center"/>
+          </w:tcPr>
+          <w:p>
+            <w:pPr>
+              <w:spacing w:before="0" w:after="20" w:line="264" w:lineRule="auto"/>
+              <w:jc w:val="center"/>
+            </w:pPr>
+            <w:r>
+              <w:rPr>
+                <w:rFonts w:ascii="Times New Roman" w:hAnsi="Times New Roman" w:eastAsia="Times New Roman" w:cs="Times New Roman"/>
+                <w:sz w:val="24"/>
+              </w:rPr>
+              <w:t>HĐ1 – chiếu đầu Tiết 1</w:t>
             </w:r>
           </w:p>
         </w:tc>

</xml_diff>